<commit_message>
Paper: Project 2 headline; numbers made consistent; readability worksheet
- Paper: the abstract and a new 'Held-out result (Project 2)' paragraph give the
  Project 2 headline (7 of 16 evidence files, 5 in the top ten, 1 of 3 decoys; the
  drive-wide date pattern). Test count 51 -> 59. PDF and Word rebuilt; still 4 pages.
- Results draft: records the 2026-10-27 re-run at df39dbe and the browser edition's
  same-answers check on both images.
- Readability Check - Russell.md: the top-20 sentences of both projects, copied
  from leads.csv, with a column for the author's own judgement (Section D).

Co-Authored-By: Claude Opus 5.5 (1M context) <noreply@anthropic.com>
</commit_message>
<xml_diff>
--- a/paper/CPRE 5360 Term Paper Draft - Russell.docx
+++ b/paper/CPRE 5360 Term Paper Draft - Russell.docx
@@ -95,7 +95,7 @@
           <w:i w:val="0"/>
           <w:sz w:val="18"/>
         </w:rPr>
-        <w:t>A person hiding evidence on a computer can change the dates on a file, rename a photo to look like a program, or tuck a file inside another one, each in seconds. But a drive records the same facts in several independent places, and a cover-up rarely keeps all of them in agreement. This paper proposes the Artifact Disagreement Scorer (ADS), a tool that checks a drive's records against each other and points an examiner to the files where they disagree. It has two families of checks: eleven rules that compare the dates Windows keeps in different places, and eight first-look questions that compare what a file claims to be with what it holds. It combines the results into one ranked list with a plain-language reason for every flag. The evaluation is a proof of function on the two forensic images from this course, using my own EnCase and FTK examinations as the answer key. On the first image, a development case, ADS listed all seven evidence files I had found by hand among 2,246 files, six of them in its top ten. The second image is a held-out test: the checks were frozen before it was examined.</w:t>
+        <w:t>A person hiding evidence on a computer can change the dates on a file, rename a photo to look like a program, or tuck a file inside another one, each in seconds. But a drive records the same facts in several independent places, and a cover-up rarely keeps all of them in agreement. This paper proposes the Artifact Disagreement Scorer (ADS), a tool that checks a drive's records against each other and points an examiner to the files where they disagree. It has two families of checks: eleven rules that compare the dates Windows keeps in different places, and eight first-look questions that compare what a file claims to be with what it holds. It combines the results into one ranked list with a plain-language reason for every flag. The evaluation is a proof of function on the two forensic images from this course, using my own EnCase and FTK examinations as the answer key. On the first image, a development case, ADS listed all seven evidence files I had found by hand among 2,246 files, six of them in its top ten. The second image is a held-out test: the checks were frozen before it was examined. On it, ADS listed seven of the sixteen evidence files among 4,818 files, five in its top ten, and showed that nearly every visible date on the drive had been set to one moment.</w:t>
       </w:r>
     </w:p>
     <w:p>
@@ -3182,7 +3182,7 @@
           <w:i w:val="0"/>
           <w:sz w:val="20"/>
         </w:rPr>
-        <w:t>ADS is written in Python 3 with only the standard library, so it runs on any computer with Python installed. It reads FAT and NTFS images itself, read-only. Both readers were checked against The Sleuth Kit: the FAT reader matched it byte for byte on all 4,923 files of the Project 1 image, and the NTFS reader matched it on every file of a test image built to include fragmented, hard-linked, hidden and deleted files, and on 3,605 files of a larger partitioned image. Every input is hashed with SHA-256. Each check is a separate function that records the values it compared, and the same code produces each single-check baseline ("C1 only," "R6 only") from identical inputs. The pipeline passes 51 automated tests.</w:t>
+        <w:t>ADS is written in Python 3 with only the standard library, so it runs on any computer with Python installed. It reads FAT and NTFS images itself, read-only. Both readers were checked against The Sleuth Kit: the FAT reader matched it byte for byte on all 4,923 files of the Project 1 image, and the NTFS reader matched it on every file of a test image built to include fragmented, hard-linked, hidden and deleted files, and on 3,605 files of a larger partitioned image. Every input is hashed with SHA-256. Each check is a separate function that records the values it compared, and the same code produces each single-check baseline ("C1 only," "R6 only") from identical inputs. The pipeline passes 59 automated tests.</w:t>
       </w:r>
     </w:p>
     <w:p>
@@ -3935,6 +3935,31 @@
     </w:p>
     <w:p>
       <w:pPr>
+        <w:spacing w:before="0" w:after="0" w:line="240" w:lineRule="auto"/>
+        <w:ind w:firstLine="202"/>
+        <w:jc w:val="both"/>
+      </w:pPr>
+      <w:r>
+        <w:rPr>
+          <w:rFonts w:ascii="Times New Roman" w:hAnsi="Times New Roman"/>
+          <w:b/>
+          <w:i w:val="0"/>
+          <w:sz w:val="20"/>
+        </w:rPr>
+        <w:t>Held-out result (Project 2).</w:t>
+      </w:r>
+      <w:r>
+        <w:rPr>
+          <w:rFonts w:ascii="Times New Roman" w:hAnsi="Times New Roman"/>
+          <w:b w:val="0"/>
+          <w:i w:val="0"/>
+          <w:sz w:val="20"/>
+        </w:rPr>
+        <w:t xml:space="preserve"> With the checks frozen, ADS listed 164 of 4,818 files. 7 of the 16 evidence files were among them, 5 in the top ten, and all within the top 15, with 7 files outside the key above the last one. One of the 3 decoys was listed. ADS found less than half of the evidence, and as on Project 1 the narrow checks beat it at budgets of one to three files, so the first two success criteria below were not met. Every top-twenty flag carries a plain-language explanation, and each of the nine misses is explained by what ADS does not read, such as document metadata, page content, or a password written as "pswd =". The date rules R6 and R7 fired on almost every file: nearly every visible date had been set to 2 Oct 2011 11:57:01, while the FN dates show the files were written in two batches six years apart. Because those rules fire everywhere, their weight fell to nearly zero and no single file was flagged.</w:t>
+      </w:r>
+    </w:p>
+    <w:p>
+      <w:pPr>
         <w:keepNext/>
         <w:spacing w:before="80" w:after="40" w:line="240" w:lineRule="auto"/>
         <w:jc w:val="left"/>
@@ -4026,7 +4051,7 @@
           <w:i w:val="0"/>
           <w:sz w:val="20"/>
         </w:rPr>
-        <w:t>The tool, both readers, the answer keys, and the runs on both projects (October 26) are done; the Project 1 result reproduced exactly on a second computer. Project 2's results, including the date checks, are reported in Section V of the final paper (by Dec 6).</w:t>
+        <w:t>The tool, both readers, the answer keys, and the runs on both projects (October 26) are done; the Project 1 result reproduced exactly on a second computer. Project 2's full results, including the date checks, are reported in Section V of the final paper (by Dec 6).</w:t>
       </w:r>
     </w:p>
     <w:p>

</xml_diff>